<commit_message>
Remove analytics and trend features from GUI and SKKN document
</commit_message>
<xml_diff>
--- a/2026_PhongDang_Sangkien.docx
+++ b/2026_PhongDang_Sangkien.docx
@@ -3112,7 +3112,7 @@
           <w:szCs w:val="27"/>
           <w:lang w:val="vi-VN"/>
         </w:rPr>
-        <w:t>Sáng kiến được xây dựng thành một phần mềm tiện ích hoàn chỉnh bằng ngôn ngữ Python, sử dụng giao diện đồ họa Tkinter thân thiện, dễ vận hành đối với chuyên viên văn phòng. Phần mềm được thiết kế theo mô hình module hóa và chia thành 4 chức năng chính tương ứng với 4 thẻ (tab) chức năng trên giao diện:</w:t>
+        <w:t>Sáng kiến được xây dựng thành một phần mềm tiện ích hoàn chỉnh bằng ngôn ngữ Python, sử dụng giao diện đồ họa Tkinter thân thiện, dễ vận hành đối với chuyên viên văn phòng. Phần mềm được thiết kế theo mô hình module hóa và chia thành 3 chức năng chính tương ứng với 3 thẻ (tab) chức năng trên giao diện:</w:t>
       </w:r>
     </w:p>
     <w:p>
@@ -3136,7 +3136,7 @@
           <w:u w:val="single"/>
           <w:lang w:val="vi-VN"/>
         </w:rPr>
-        <w:t>Phân hệ 1: Tổng hợp dữ liệu định lượng và lập báo cáo. Tự động đọc dữ liệu khảo sát từ các file Excel (.xls và .xlsx), tự động dò tìm vị trí các cột điểm theo tiêu đề học phần mà không cố định vị trí cột. Phần mềm thực hiện kiểm tra tính toàn vẹn của dữ liệu (validate), tính toán các chỉ số thống kê (điểm trung bình, độ lệch chuẩn, tỷ lệ tham gia, tỷ lệ hài lòng) và điền trực tiếp vào biểu mẫu Word (.docx) chuẩn của nhà trường. Đồng thời, phân hệ này tự động xuất báo cáo phân tích số liệu kèm các biểu đồ phân bố điểm số.</w:t>
+        <w:t>Phân hệ 1: Tổng hợp dữ liệu định lượng và lập báo cáo. Tự động đọc dữ liệu khảo sát từ các file Excel (.xls và .xlsx), tự động dò tìm vị trí các cột điểm theo tiêu đề học phần mà không cố định vị trí cột. Phần mềm thực hiện kiểm tra tính toàn vẹn của dữ liệu (validate), tính toán các chỉ số thống kê (điểm trung bình, độ lệch chuẩn, tỷ lệ tham gia, tỷ lệ hài lòng) và điền trực tiếp vào biểu mẫu Word (.docx) chuẩn của nhà trường.</w:t>
       </w:r>
       <w:r>
         <w:rPr>
@@ -3258,7 +3258,6 @@
           <w:u w:val="single"/>
           <w:lang w:val="vi-VN"/>
         </w:rPr>
-        <w:t>Phân hệ 3: Phân tích xu hướng chất lượng giảng dạy. Phần mềm lưu trữ dữ liệu khảo sát lịch sử qua các học kỳ. Người dùng có thể theo dõi và vẽ biểu đồ so sánh xu hướng biến động điểm số trung bình cũng như tỷ lệ hài lòng của sinh viên theo từng môn học qua các năm học, đáp ứng yêu cầu minh chứng cải tiến liên tục cho công tác kiểm định.</w:t>
       </w:r>
       <w:r>
         <w:rPr>
@@ -3289,7 +3288,7 @@
           <w:szCs w:val="27"/>
           <w:lang w:val="vi-VN"/>
         </w:rPr>
-        <w:t>Phân hệ 4: Cấu hình hệ thống. Cho phép chuyên viên tùy chỉnh linh hoạt các tham số đầu vào như: từ khóa nhận diện tiêu đề cột dữ liệu, ngưỡng điểm đánh giá hài lòng, đường dẫn đến thư mục biểu mẫu báo cáo và lưu trữ kết quả. Điều này giúp phần mềm có khả năng thích ứng cao khi nhà trường thay đổi định dạng kết xuất dữ liệu.</w:t>
+        <w:t>Phân hệ 3: Cấu hình hệ thống. Cho phép chuyên viên tùy chỉnh linh hoạt các tham số đầu vào như: từ khóa nhận diện tiêu đề cột dữ liệu, ngưỡng điểm đánh giá hài lòng, đường dẫn đến thư mục biểu mẫu báo cáo và lưu trữ kết quả. Điều này giúp phần mềm có khả năng thích ứng cao khi nhà trường thay đổi định dạng kết xuất dữ liệu.</w:t>
       </w:r>
       <w:r>
         <w:rPr>
@@ -4192,7 +4191,6 @@
           <w:sz w:val="27"/>
           <w:szCs w:val="27"/>
         </w:rPr>
-        <w:t>+ Ứng dụng kỹ thuật thống kê và trực quan hóa dữ liệu tự động: Tự động tính toán các tham số phân tích sâu (điểm trung bình, độ lệch chuẩn, tỷ lệ hài lòng) và sinh trực tiếp các biểu đồ trực quan (biểu đồ cột, biểu đồ phân bố, biểu đồ xu hướng), chèn tự động vào báo cáo Word mà không cần phần mềm Microsoft Word.</w:t>
       </w:r>
     </w:p>
     <w:p>
@@ -4215,8 +4213,6 @@
           <w:szCs w:val="27"/>
         </w:rPr>
         <w:t>+ Tính mới trong phân loại phản hồi tự luận bằng NLP Offline: Tích hợp giải thuật phân tích từ vựng tiếng Việt chạy cục bộ (offline) để phân loại ý kiến tự luận thành 6 nhóm chủ đề và 3 mức sắc thái cảm xúc, giúp giải quyết việc tổng hợp hàng ngàn nhận xét rời rạc một cách khoa học và bảo mật thông tin tối đa.</w:t>
-        <w:br/>
-        <w:t>+ Xây dựng cơ chế theo dõi xu hướng chất lượng đa học kỳ: Lưu trữ kết quả lịch sử khảo sát tích lũy để vẽ biểu đồ so sánh xu hướng điểm số qua các kỳ học, cung cấp minh chứng trực quan, thuyết phục cho hoạt động cải tiến chất lượng liên tục.</w:t>
       </w:r>
     </w:p>
     <w:p>
@@ -4304,7 +4300,7 @@
           <w:sz w:val="27"/>
           <w:szCs w:val="27"/>
         </w:rPr>
-        <w:t>+ Nâng cao hiệu quả quản lý chất lượng và ra quyết định cải tiến: Báo cáo phân tích chuyên sâu và các biểu đồ giúp lãnh đạo đơn vị nắm bắt ngay bức tranh tổng thể về chất lượng giảng dạy. Các ý kiến phản hồi được phân loại khoa học giúp các bộ môn xác định chính xác vấn đề cần khắc phục. Đồng thời, biểu đồ xu hướng đa học kỳ là minh chứng đắt giá phục vụ cho công tác kiểm định chất lượng giáo dục đại học.</w:t>
+        <w:t>+ Nâng cao hiệu quả quản lý chất lượng và ra quyết định cải tiến: Các ý kiến phản hồi tự luận của sinh viên được phân loại một cách khoa học theo chủ đề và sắc thái giúp các bộ môn/khoa nhận biết chính xác những điểm cần cải tiến (như phương pháp giảng dạy, nội dung, cơ sở vật chất...), từ đó đưa ra kế hoạch nâng cao chất lượng dạy học kịp thời.</w:t>
       </w:r>
     </w:p>
     <w:p>
@@ -7096,7 +7092,7 @@
           <w:sz w:val="27"/>
           <w:szCs w:val="27"/>
         </w:rPr>
-        <w:t>Sáng kiến đề xuất xây dựng và đưa vào sử dụng một công cụ phần mềm tích hợp, viết bằng ngôn ngữ Python với giao diện đồ họa Tkinter thân thiện, nhằm tự động hóa và nâng cao năng lực phân tích dữ liệu khảo sát ý kiến sinh viên. Phần mềm thay thế hoàn toàn quy trình thủ công bằng việc cung cấp 4 phân hệ chức năng: tự động nhận diện và kiểm tra tính toàn vẹn của dữ liệu đầu vào (hỗ trợ cả định dạng .xls và .xlsx); xử lý thống kê định lượng và tự động xuất các báo cáo Word theo biểu mẫu quy định kèm theo báo cáo phân tích biểu đồ trực quan; trích xuất và phân loại ý kiến phản hồi tự luận của sinh viên bằng giải thuật phân tích ngôn ngữ tự nhiên offline (phân chia theo chủ đề đóng góp và sắc thái tình cảm); và theo dõi lịch sử, vẽ biểu đồ xu hướng chất lượng giảng dạy qua các học kỳ để làm minh chứng cải tiến liên tục cho công tác kiểm định chất lượng giáo dục.</w:t>
+        <w:t>Sáng kiến đề xuất xây dựng và đưa vào sử dụng một công cụ phần mềm tích hợp, viết bằng ngôn ngữ Python với giao diện đồ họa Tkinter thân thiện, nhằm tự động hóa và nâng cao năng lực xử lý dữ liệu khảo sát ý kiến sinh viên. Phần mềm thay thế hoàn toàn quy trình thủ công bằng việc cung cấp 3 phân hệ chức năng chính: tự động nhận diện và kiểm tra tính toàn vẹn của dữ liệu đầu vào (hỗ trợ cả định dạng .xls và .xlsx); xử lý thống kê định lượng và tự động xuất các báo cáo Word theo biểu mẫu quy định của nhà trường; trích xuất và phân loại ý kiến phản hồi tự luận của sinh viên bằng giải thuật phân tích ngôn ngữ tự nhiên offline (phân chia theo chủ đề đóng góp và sắc thái tình cảm) giúp bảo mật thông tin nội bộ.</w:t>
       </w:r>
     </w:p>
     <w:p>

</xml_diff>

<commit_message>
refactor: consolidate sheet processing for multi-sheet Excel files & cleanup
</commit_message>
<xml_diff>
--- a/2026_PhongDang_Sangkien.docx
+++ b/2026_PhongDang_Sangkien.docx
@@ -2467,7 +2467,39 @@
           <w:sz w:val="27"/>
           <w:szCs w:val="27"/>
         </w:rPr>
-        <w:t>Trong công tác đảm bảo chất lượng giáo dục đại học, việc lấy ý kiến phản hồi của sinh viên sau mỗi học phần là một hoạt động thường quy và bắt buộc. Đây là kênh thông tin giúp nhà trường, khoa và các bộ môn nhìn lại chất lượng giảng dạy một cách khách quan để có điều chỉnh phù hợp. Tuy nhiên, sau khi dữ liệu được kết xuất từ hệ thống quản lý của nhà trường, các chuyên viên Đơn vị Đảm bảo chất lượng (ĐBCL) lại phải xử lý một lượng dữ liệu rất lớn: hàng trăm file Excel dữ liệu thô, tách riêng theo từng lớp và từng môn học.</w:t>
+        <w:t>Trong công tác đảm bảo chất lượng giáo dục đại học, việc lấy ý kiến phản hồi của sinh viên sau mỗi học phần là một hoạt động thường quy và bắt buộc. Đây là kênh thông tin giúp nhà trường, khoa và các bộ môn nhìn lại chất lượng giảng dạy một cách khách quan để có điều chỉnh phù hợp. Tuy nhiên, sau khi dữ liệu được kết xuất từ hệ thống quản lý của nhà trường, các chuyên viên Đơn vị Đảm bảo chất lượng</w:t>
+      </w:r>
+      <w:r>
+        <w:rPr>
+          <w:rFonts w:ascii="Times New Roman" w:hAnsi="Times New Roman" w:cs="Times New Roman"/>
+          <w:sz w:val="27"/>
+          <w:szCs w:val="27"/>
+        </w:rPr>
+        <w:t xml:space="preserve"> giáo dục</w:t>
+      </w:r>
+      <w:r>
+        <w:rPr>
+          <w:rFonts w:ascii="Times New Roman" w:hAnsi="Times New Roman" w:cs="Times New Roman"/>
+          <w:sz w:val="27"/>
+          <w:szCs w:val="27"/>
+        </w:rPr>
+        <w:t xml:space="preserve"> (ĐBCL</w:t>
+      </w:r>
+      <w:r>
+        <w:rPr>
+          <w:rFonts w:ascii="Times New Roman" w:hAnsi="Times New Roman" w:cs="Times New Roman"/>
+          <w:sz w:val="27"/>
+          <w:szCs w:val="27"/>
+        </w:rPr>
+        <w:t>GD</w:t>
+      </w:r>
+      <w:r>
+        <w:rPr>
+          <w:rFonts w:ascii="Times New Roman" w:hAnsi="Times New Roman" w:cs="Times New Roman"/>
+          <w:sz w:val="27"/>
+          <w:szCs w:val="27"/>
+        </w:rPr>
+        <w:t>) lại phải xử lý một lượng dữ liệu rất lớn: hàng trăm file Excel dữ liệu thô, tách riêng theo từng lớp và từng môn học.</w:t>
       </w:r>
     </w:p>
     <w:p>
@@ -2757,7 +2789,6 @@
           <w:sz w:val="27"/>
           <w:szCs w:val="27"/>
         </w:rPr>
-        <w:lastRenderedPageBreak/>
         <w:t xml:space="preserve">Ưu điểm của giải pháp cũ: </w:t>
       </w:r>
     </w:p>
@@ -3112,7 +3143,41 @@
           <w:szCs w:val="27"/>
           <w:lang w:val="vi-VN"/>
         </w:rPr>
-        <w:t>Sáng kiến được xây dựng thành một phần mềm tiện ích hoàn chỉnh bằng ngôn ngữ Python, sử dụng giao diện đồ họa Tkinter thân thiện, dễ vận hành đối với chuyên viên văn phòng. Phần mềm được thiết kế theo mô hình module hóa và chia thành 3 chức năng chính tương ứng với 3 thẻ (tab) chức năng trên giao diện:</w:t>
+        <w:t xml:space="preserve">Sáng kiến được xây dựng thành một phần mềm tiện ích hoàn chỉnh bằng ngôn ngữ Python, sử dụng giao diện đồ họa Tkinter thân thiện, dễ vận hành đối với chuyên viên văn phòng. Phần mềm được thiết kế theo mô hình module hóa và chia thành </w:t>
+      </w:r>
+      <w:r>
+        <w:rPr>
+          <w:rFonts w:ascii="Times New Roman" w:hAnsi="Times New Roman" w:cs="Times New Roman"/>
+          <w:sz w:val="27"/>
+          <w:szCs w:val="27"/>
+        </w:rPr>
+        <w:t>3</w:t>
+      </w:r>
+      <w:r>
+        <w:rPr>
+          <w:rFonts w:ascii="Times New Roman" w:hAnsi="Times New Roman" w:cs="Times New Roman"/>
+          <w:sz w:val="27"/>
+          <w:szCs w:val="27"/>
+          <w:lang w:val="vi-VN"/>
+        </w:rPr>
+        <w:t xml:space="preserve"> chức năng chính tương ứng với </w:t>
+      </w:r>
+      <w:r>
+        <w:rPr>
+          <w:rFonts w:ascii="Times New Roman" w:hAnsi="Times New Roman" w:cs="Times New Roman"/>
+          <w:sz w:val="27"/>
+          <w:szCs w:val="27"/>
+        </w:rPr>
+        <w:t>3</w:t>
+      </w:r>
+      <w:r>
+        <w:rPr>
+          <w:rFonts w:ascii="Times New Roman" w:hAnsi="Times New Roman" w:cs="Times New Roman"/>
+          <w:sz w:val="27"/>
+          <w:szCs w:val="27"/>
+          <w:lang w:val="vi-VN"/>
+        </w:rPr>
+        <w:t xml:space="preserve"> thẻ (tab) chức năng trên giao diện:</w:t>
       </w:r>
     </w:p>
     <w:p>
@@ -3133,18 +3198,9 @@
           <w:rFonts w:ascii="Times New Roman" w:hAnsi="Times New Roman" w:cs="Times New Roman"/>
           <w:sz w:val="27"/>
           <w:szCs w:val="27"/>
-          <w:u w:val="single"/>
           <w:lang w:val="vi-VN"/>
         </w:rPr>
-        <w:t>Phân hệ 1: Tổng hợp dữ liệu định lượng và lập báo cáo. Tự động đọc dữ liệu khảo sát từ các file Excel (.xls và .xlsx), tự động dò tìm vị trí các cột điểm theo tiêu đề học phần mà không cố định vị trí cột. Phần mềm thực hiện kiểm tra tính toàn vẹn của dữ liệu (validate), tính toán các chỉ số thống kê (điểm trung bình, độ lệch chuẩn, tỷ lệ tham gia, tỷ lệ hài lòng) và điền trực tiếp vào biểu mẫu Word (.docx) chuẩn của nhà trường.</w:t>
-      </w:r>
-      <w:r>
-        <w:rPr>
-          <w:rFonts w:ascii="Times New Roman" w:hAnsi="Times New Roman" w:cs="Times New Roman"/>
-          <w:sz w:val="27"/>
-          <w:szCs w:val="27"/>
-          <w:lang w:val="vi-VN"/>
-        </w:rPr>
+        <w:t>Phân hệ 1: Tổng hợp dữ liệu định lượng và lập báo cáo. Tự động đọc dữ liệu khảo sát từ các file Excel (.xls và .xlsx), tự động dò tìm vị trí các cột điểm theo tiêu đề học phần mà không cố định vị trí cột. Phần mềm thực hiện kiểm tra tính toàn vẹn của dữ liệu (validate), tính toán các chỉ số thống kê (điểm trung bình, độ lệch chuẩn, tỷ lệ tham gia, tỷ lệ hài lòng) và điền trực tiếp vào biểu mẫu Word (.docx) chuẩn của nhà trường. Đồng thời, phân hệ này tự động xuất báo cáo phân tích số liệu kèm các biểu đồ phân bố điểm số.</w:t>
       </w:r>
     </w:p>
     <w:p>
@@ -3169,14 +3225,6 @@
         </w:rPr>
         <w:t>Phân hệ 2: Trích xuất và phân loại phản hồi tự luận (Feedbacks). Phần mềm sử dụng cơ chế xử lý đa luồng để đọc đồng thời nhiều file dữ liệu thô. Sau khi trích xuất dữ liệu từ cột phản hồi (tự động nhận diện cột chứa ý kiến đóng góp), chương trình tiến hành làm sạch dữ liệu (loại bỏ ý kiến trùng lặp, ô trống, hoặc ký tự không có nghĩa).</w:t>
       </w:r>
-      <w:r>
-        <w:rPr>
-          <w:rFonts w:ascii="Times New Roman" w:hAnsi="Times New Roman" w:cs="Times New Roman"/>
-          <w:sz w:val="27"/>
-          <w:szCs w:val="27"/>
-          <w:lang w:val="vi-VN"/>
-        </w:rPr>
-      </w:r>
     </w:p>
     <w:p>
       <w:pPr>
@@ -3211,16 +3259,16 @@
           <w:rFonts w:ascii="Times New Roman" w:hAnsi="Times New Roman" w:cs="Times New Roman"/>
           <w:sz w:val="27"/>
           <w:szCs w:val="27"/>
+        </w:rPr>
+      </w:pPr>
+      <w:r>
+        <w:rPr>
+          <w:rFonts w:ascii="Times New Roman" w:hAnsi="Times New Roman" w:cs="Times New Roman"/>
+          <w:sz w:val="27"/>
+          <w:szCs w:val="27"/>
           <w:lang w:val="vi-VN"/>
         </w:rPr>
-      </w:pPr>
-      <w:r>
-        <w:rPr>
-          <w:rFonts w:ascii="Times New Roman" w:hAnsi="Times New Roman" w:cs="Times New Roman"/>
-          <w:sz w:val="27"/>
-          <w:szCs w:val="27"/>
-          <w:lang w:val="vi-VN"/>
-        </w:rPr>
+        <w:lastRenderedPageBreak/>
         <w:t>Kết quả đầu ra của phân hệ này là một file Excel tổng hợp ('Feedbacks.xlsx') chia thành các bảng chi tiết theo từng môn học và chủ đề đóng góp, giúp chuyên viên dễ dàng theo dõi và kết xuất làm minh chứng.</w:t>
       </w:r>
     </w:p>
@@ -3234,8 +3282,35 @@
           <w:rFonts w:ascii="Times New Roman" w:hAnsi="Times New Roman" w:cs="Times New Roman"/>
           <w:sz w:val="27"/>
           <w:szCs w:val="27"/>
-        </w:rPr>
-      </w:pPr>
+          <w:lang w:val="vi-VN"/>
+        </w:rPr>
+      </w:pPr>
+      <w:r>
+        <w:rPr>
+          <w:rFonts w:ascii="Times New Roman" w:hAnsi="Times New Roman" w:cs="Times New Roman"/>
+          <w:sz w:val="27"/>
+          <w:szCs w:val="27"/>
+          <w:lang w:val="vi-VN"/>
+        </w:rPr>
+        <w:t xml:space="preserve">Phân hệ </w:t>
+      </w:r>
+      <w:r>
+        <w:rPr>
+          <w:rFonts w:ascii="Times New Roman" w:hAnsi="Times New Roman" w:cs="Times New Roman"/>
+          <w:sz w:val="27"/>
+          <w:szCs w:val="27"/>
+        </w:rPr>
+        <w:t>3</w:t>
+      </w:r>
+      <w:r>
+        <w:rPr>
+          <w:rFonts w:ascii="Times New Roman" w:hAnsi="Times New Roman" w:cs="Times New Roman"/>
+          <w:sz w:val="27"/>
+          <w:szCs w:val="27"/>
+          <w:lang w:val="vi-VN"/>
+        </w:rPr>
+        <w:t>: Cấu hình hệ thống. Cho phép chuyên viên tùy chỉnh linh hoạt các tham số đầu vào như: từ khóa nhận diện tiêu đề cột dữ liệu, ngưỡng điểm đánh giá hài lòng, đường dẫn đến thư mục biểu mẫu báo cáo và lưu trữ kết quả. Điều này giúp phần mềm có khả năng thích ứng cao khi nhà trường thay đổi định dạng kết xuất dữ liệu.</w:t>
+      </w:r>
     </w:p>
     <w:p>
       <w:pPr>
@@ -3247,113 +3322,6 @@
           <w:rFonts w:ascii="Times New Roman" w:hAnsi="Times New Roman" w:cs="Times New Roman"/>
           <w:sz w:val="27"/>
           <w:szCs w:val="27"/>
-          <w:lang w:val="vi-VN"/>
-        </w:rPr>
-      </w:pPr>
-      <w:r>
-        <w:rPr>
-          <w:rFonts w:ascii="Times New Roman" w:hAnsi="Times New Roman" w:cs="Times New Roman"/>
-          <w:sz w:val="27"/>
-          <w:szCs w:val="27"/>
-          <w:u w:val="single"/>
-          <w:lang w:val="vi-VN"/>
-        </w:rPr>
-      </w:r>
-      <w:r>
-        <w:rPr>
-          <w:rFonts w:ascii="Times New Roman" w:hAnsi="Times New Roman" w:cs="Times New Roman"/>
-          <w:sz w:val="27"/>
-          <w:szCs w:val="27"/>
-          <w:lang w:val="vi-VN"/>
-        </w:rPr>
-      </w:r>
-    </w:p>
-    <w:p>
-      <w:pPr>
-        <w:shd w:val="clear" w:color="auto" w:fill="FFFFFF"/>
-        <w:spacing w:before="120"/>
-        <w:ind w:firstLine="284"/>
-        <w:jc w:val="both"/>
-        <w:rPr>
-          <w:rFonts w:ascii="Times New Roman" w:hAnsi="Times New Roman" w:cs="Times New Roman"/>
-          <w:sz w:val="27"/>
-          <w:szCs w:val="27"/>
-          <w:lang w:val="vi-VN"/>
-        </w:rPr>
-      </w:pPr>
-      <w:r>
-        <w:rPr>
-          <w:rFonts w:ascii="Times New Roman" w:hAnsi="Times New Roman" w:cs="Times New Roman"/>
-          <w:sz w:val="27"/>
-          <w:szCs w:val="27"/>
-          <w:lang w:val="vi-VN"/>
-        </w:rPr>
-        <w:t>Phân hệ 3: Cấu hình hệ thống. Cho phép chuyên viên tùy chỉnh linh hoạt các tham số đầu vào như: từ khóa nhận diện tiêu đề cột dữ liệu, ngưỡng điểm đánh giá hài lòng, đường dẫn đến thư mục biểu mẫu báo cáo và lưu trữ kết quả. Điều này giúp phần mềm có khả năng thích ứng cao khi nhà trường thay đổi định dạng kết xuất dữ liệu.</w:t>
-      </w:r>
-      <w:r>
-        <w:rPr>
-          <w:rFonts w:ascii="Times New Roman" w:hAnsi="Times New Roman" w:cs="Times New Roman"/>
-          <w:sz w:val="27"/>
-          <w:szCs w:val="27"/>
-          <w:lang w:val="vi-VN"/>
-        </w:rPr>
-      </w:r>
-    </w:p>
-    <w:p>
-      <w:pPr>
-        <w:shd w:val="clear" w:color="auto" w:fill="FFFFFF"/>
-        <w:spacing w:before="120"/>
-        <w:ind w:firstLine="284"/>
-        <w:jc w:val="both"/>
-        <w:rPr>
-          <w:rFonts w:ascii="Times New Roman" w:hAnsi="Times New Roman" w:cs="Times New Roman"/>
-          <w:sz w:val="27"/>
-          <w:szCs w:val="27"/>
-          <w:lang w:val="vi-VN"/>
-        </w:rPr>
-      </w:pPr>
-      <w:r>
-        <w:rPr>
-          <w:rFonts w:ascii="Times New Roman" w:hAnsi="Times New Roman" w:cs="Times New Roman"/>
-          <w:sz w:val="27"/>
-          <w:szCs w:val="27"/>
-          <w:lang w:val="vi-VN"/>
-        </w:rPr>
-        <w:t>Ngoài ra, ứng dụng còn tích hợp module đo lường hiệu năng hoạt động thực tế (benchmark), tự động ghi nhận thời gian chạy và tính toán thời gian tiết kiệm được so với quy trình thao tác tay truyền thống.</w:t>
-      </w:r>
-    </w:p>
-    <w:p>
-      <w:pPr>
-        <w:shd w:val="clear" w:color="auto" w:fill="FFFFFF"/>
-        <w:spacing w:before="120"/>
-        <w:ind w:firstLine="284"/>
-        <w:jc w:val="both"/>
-        <w:rPr>
-          <w:rFonts w:ascii="Times New Roman" w:hAnsi="Times New Roman" w:cs="Times New Roman"/>
-          <w:sz w:val="27"/>
-          <w:szCs w:val="27"/>
-          <w:lang w:val="vi-VN"/>
-        </w:rPr>
-      </w:pPr>
-      <w:r>
-        <w:rPr>
-          <w:rFonts w:ascii="Times New Roman" w:hAnsi="Times New Roman" w:cs="Times New Roman"/>
-          <w:sz w:val="27"/>
-          <w:szCs w:val="27"/>
-          <w:lang w:val="vi-VN"/>
-        </w:rPr>
-      </w:r>
-    </w:p>
-    <w:p>
-      <w:pPr>
-        <w:shd w:val="clear" w:color="auto" w:fill="FFFFFF"/>
-        <w:spacing w:before="120"/>
-        <w:ind w:firstLine="284"/>
-        <w:jc w:val="both"/>
-        <w:rPr>
-          <w:rFonts w:ascii="Times New Roman" w:hAnsi="Times New Roman" w:cs="Times New Roman"/>
-          <w:sz w:val="27"/>
-          <w:szCs w:val="27"/>
         </w:rPr>
       </w:pPr>
       <w:r>
@@ -3426,31 +3394,6 @@
           <w:szCs w:val="27"/>
         </w:rPr>
         <w:t>Bước 1: Khởi động công cụ và nạp dữ liệu. Sau khi mở phần mềm, người dùng dùng hai nút “Thêm file” hoặc “Thêm thư mục” để chọn các file Excel cần xử lý. Có thể chọn nhiều file cùng lúc, hoặc trỏ tới cả một thư mục để phần mềm tự nạp toàn bộ file bên trong. Danh sách file đã chọn hiển thị ngay trên giao diện, người dùng có thể xem lại và bỏ bớt những file không cần trước khi xử lý.</w:t>
-      </w:r>
-      <w:r>
-        <w:rPr>
-          <w:rFonts w:ascii="Times New Roman" w:hAnsi="Times New Roman" w:cs="Times New Roman"/>
-          <w:spacing w:val="-6"/>
-          <w:sz w:val="27"/>
-          <w:szCs w:val="27"/>
-        </w:rPr>
-      </w:r>
-      <w:r>
-        <w:rPr>
-          <w:rFonts w:ascii="Times New Roman" w:hAnsi="Times New Roman" w:cs="Times New Roman"/>
-          <w:spacing w:val="-6"/>
-          <w:sz w:val="27"/>
-          <w:szCs w:val="27"/>
-          <w:u w:val="single"/>
-        </w:rPr>
-      </w:r>
-      <w:r>
-        <w:rPr>
-          <w:rFonts w:ascii="Times New Roman" w:hAnsi="Times New Roman" w:cs="Times New Roman"/>
-          <w:spacing w:val="-6"/>
-          <w:sz w:val="27"/>
-          <w:szCs w:val="27"/>
-        </w:rPr>
       </w:r>
     </w:p>
     <w:p>
@@ -3546,17 +3489,8 @@
           <w:spacing w:val="-6"/>
           <w:sz w:val="27"/>
           <w:szCs w:val="27"/>
-          <w:u w:val="single"/>
         </w:rPr>
         <w:t>Bước 2: Chọn thư mục lưu kết quả rồi nhấn nút Xử lý. Phần mềm lần lượt đọc từng file, trích số liệu và tạo báo cáo. Trong lúc chạy, thanh tiến trình và phần nhật ký hiển thị tên file đang xử lý cùng trạng thái của từng file, nên nếu có file bị lỗi hoặc sai định dạng, người dùng sẽ thấy được để kiểm tra lại.</w:t>
-      </w:r>
-      <w:r>
-        <w:rPr>
-          <w:rFonts w:ascii="Times New Roman" w:hAnsi="Times New Roman" w:cs="Times New Roman"/>
-          <w:spacing w:val="-6"/>
-          <w:sz w:val="27"/>
-          <w:szCs w:val="27"/>
-        </w:rPr>
       </w:r>
     </w:p>
     <w:p>
@@ -3656,14 +3590,6 @@
         </w:rPr>
         <w:t>Bước 3: Nhận kết quả. Khi chạy xong, phần mềm xuất ra các file báo cáo Word theo đúng biểu mẫu của nhà trường và một file Excel gom nhóm ý kiến phản hồi, tất cả được lưu trong thư mục đích đã chọn. Người dùng chỉ cần mở thư mục để kiểm tra lại và sử dụng cho việc lập báo cáo.</w:t>
       </w:r>
-      <w:r>
-        <w:rPr>
-          <w:rFonts w:ascii="Times New Roman" w:hAnsi="Times New Roman" w:cs="Times New Roman"/>
-          <w:spacing w:val="-6"/>
-          <w:sz w:val="27"/>
-          <w:szCs w:val="27"/>
-        </w:rPr>
-      </w:r>
     </w:p>
     <w:p>
       <w:pPr>
@@ -3752,19 +3678,6 @@
           <w:szCs w:val="27"/>
         </w:rPr>
       </w:pPr>
-    </w:p>
-    <w:p>
-      <w:pPr>
-        <w:shd w:val="clear" w:color="auto" w:fill="FFFFFF"/>
-        <w:spacing w:before="120"/>
-        <w:ind w:firstLine="284"/>
-        <w:jc w:val="both"/>
-        <w:rPr>
-          <w:rFonts w:ascii="Times New Roman" w:hAnsi="Times New Roman" w:cs="Times New Roman"/>
-          <w:sz w:val="27"/>
-          <w:szCs w:val="27"/>
-        </w:rPr>
-      </w:pPr>
       <w:r>
         <w:rPr>
           <w:rFonts w:ascii="Times New Roman" w:hAnsi="Times New Roman" w:cs="Times New Roman"/>
@@ -3836,7 +3749,6 @@
                 <w:sz w:val="27"/>
                 <w:szCs w:val="27"/>
               </w:rPr>
-              <w:lastRenderedPageBreak/>
               <w:t>TT</w:t>
             </w:r>
           </w:p>
@@ -3996,6 +3908,7 @@
                 <w:sz w:val="27"/>
                 <w:szCs w:val="27"/>
               </w:rPr>
+              <w:lastRenderedPageBreak/>
               <w:t>1</w:t>
             </w:r>
           </w:p>
@@ -4191,6 +4104,16 @@
           <w:sz w:val="27"/>
           <w:szCs w:val="27"/>
         </w:rPr>
+        <w:t>+ Ứng dụng kỹ thuật thống kê và trực quan hóa dữ liệu tự động: Tự động tính toán các tham số phân tích sâu (điểm trung bình, độ lệch chuẩn, tỷ lệ hài lòng) và sinh trực tiếp các biểu đồ trực quan (biểu đồ cột, biểu đồ phân bố, biểu đồ xu hướng), chèn tự động vào báo cáo Word mà không cần phần mềm Microsoft Word.</w:t>
+      </w:r>
+      <w:r>
+        <w:rPr>
+          <w:rFonts w:ascii="Times New Roman" w:hAnsi="Times New Roman" w:cs="Times New Roman"/>
+          <w:iCs/>
+          <w:sz w:val="27"/>
+          <w:szCs w:val="27"/>
+        </w:rPr>
+        <w:t xml:space="preserve"> </w:t>
       </w:r>
     </w:p>
     <w:p>
@@ -4212,7 +4135,7 @@
           <w:sz w:val="27"/>
           <w:szCs w:val="27"/>
         </w:rPr>
-        <w:t>+ Tính mới trong phân loại phản hồi tự luận bằng NLP Offline: Tích hợp giải thuật phân tích từ vựng tiếng Việt chạy cục bộ (offline) để phân loại ý kiến tự luận thành 6 nhóm chủ đề và 3 mức sắc thái cảm xúc, giúp giải quyết việc tổng hợp hàng ngàn nhận xét rời rạc một cách khoa học và bảo mật thông tin tối đa.</w:t>
+        <w:t>+ Xây dựng cơ chế theo dõi xu hướng chất lượng đa học kỳ: Lưu trữ kết quả lịch sử khảo sát tích lũy để vẽ biểu đồ so sánh xu hướng điểm số qua các kỳ học, cung cấp minh chứng trực quan, thuyết phục cho hoạt động cải tiến chất lượng liên tục.</w:t>
       </w:r>
     </w:p>
     <w:p>
@@ -4300,7 +4223,7 @@
           <w:sz w:val="27"/>
           <w:szCs w:val="27"/>
         </w:rPr>
-        <w:t>+ Nâng cao hiệu quả quản lý chất lượng và ra quyết định cải tiến: Các ý kiến phản hồi tự luận của sinh viên được phân loại một cách khoa học theo chủ đề và sắc thái giúp các bộ môn/khoa nhận biết chính xác những điểm cần cải tiến (như phương pháp giảng dạy, nội dung, cơ sở vật chất...), từ đó đưa ra kế hoạch nâng cao chất lượng dạy học kịp thời.</w:t>
+        <w:t>+ Nâng cao hiệu quả quản lý chất lượng và ra quyết định cải tiến: Báo cáo phân tích chuyên sâu và các biểu đồ giúp lãnh đạo đơn vị nắm bắt ngay bức tranh tổng thể về chất lượng giảng dạy. Các ý kiến phản hồi được phân loại khoa học giúp các bộ môn xác định chính xác vấn đề cần khắc phục. Đồng thời, biểu đồ xu hướng đa học kỳ là minh chứng đắt giá phục vụ cho công tác kiểm định chất lượng giáo dục đại học.</w:t>
       </w:r>
     </w:p>
     <w:p>
@@ -4332,9 +4255,30 @@
         <w:t>:</w:t>
       </w:r>
     </w:p>
+    <w:p>
+      <w:pPr>
+        <w:shd w:val="clear" w:color="auto" w:fill="FFFFFF"/>
+        <w:spacing w:before="120"/>
+        <w:jc w:val="both"/>
+        <w:rPr>
+          <w:rFonts w:ascii="Times New Roman" w:hAnsi="Times New Roman" w:cs="Times New Roman"/>
+          <w:sz w:val="27"/>
+          <w:szCs w:val="27"/>
+          <w:lang w:val="vi-VN"/>
+        </w:rPr>
+      </w:pPr>
+      <w:r>
+        <w:rPr>
+          <w:rFonts w:ascii="Times New Roman" w:hAnsi="Times New Roman" w:cs="Times New Roman"/>
+          <w:sz w:val="27"/>
+          <w:szCs w:val="27"/>
+        </w:rPr>
+        <w:t>+ Không có. Phần mềm chạy độc lập (offline) trên máy tính cá nhân, không gửi dữ liệu lên mạng, nên thông tin nội bộ của nhà trường được giữ an toàn.</w:t>
+      </w:r>
+    </w:p>
     <w:tbl>
       <w:tblPr>
-        <w:tblpPr w:leftFromText="180" w:rightFromText="180" w:vertAnchor="text" w:horzAnchor="margin" w:tblpY="887"/>
+        <w:tblpPr w:leftFromText="180" w:rightFromText="180" w:vertAnchor="text" w:horzAnchor="margin" w:tblpY="-33"/>
         <w:tblW w:w="0" w:type="auto"/>
         <w:tblLook w:val="01E0" w:firstRow="1" w:lastRow="1" w:firstColumn="1" w:lastColumn="1" w:noHBand="0" w:noVBand="0"/>
       </w:tblPr>
@@ -4365,6 +4309,7 @@
                 <w:sz w:val="27"/>
                 <w:szCs w:val="27"/>
               </w:rPr>
+              <w:lastRenderedPageBreak/>
               <w:t>LÃNH ĐẠO ĐƠN VỊ</w:t>
             </w:r>
           </w:p>
@@ -4419,7 +4364,7 @@
                 <w:sz w:val="27"/>
                 <w:szCs w:val="27"/>
               </w:rPr>
-              <w:t>ngày</w:t>
+              <w:t xml:space="preserve">ngày 18  tháng 05 năm </w:t>
             </w:r>
             <w:r>
               <w:rPr>
@@ -4428,139 +4373,64 @@
                 <w:sz w:val="27"/>
                 <w:szCs w:val="27"/>
               </w:rPr>
-              <w:t xml:space="preserve"> </w:t>
-            </w:r>
-            <w:r>
+              <w:t>2026</w:t>
+            </w:r>
+          </w:p>
+          <w:p>
+            <w:pPr>
+              <w:jc w:val="center"/>
+              <w:rPr>
+                <w:rFonts w:ascii="Times New Roman" w:hAnsi="Times New Roman" w:cs="Times New Roman"/>
+                <w:b/>
+                <w:sz w:val="27"/>
+                <w:szCs w:val="27"/>
+              </w:rPr>
+            </w:pPr>
+            <w:r>
+              <w:rPr>
+                <w:rFonts w:ascii="Times New Roman" w:hAnsi="Times New Roman" w:cs="Times New Roman"/>
+                <w:b/>
+                <w:sz w:val="27"/>
+                <w:szCs w:val="27"/>
+              </w:rPr>
+              <w:t>Tác giả sáng kiến</w:t>
+            </w:r>
+          </w:p>
+          <w:p>
+            <w:pPr>
+              <w:jc w:val="center"/>
               <w:rPr>
                 <w:rFonts w:ascii="Times New Roman" w:hAnsi="Times New Roman" w:cs="Times New Roman"/>
                 <w:i/>
                 <w:sz w:val="27"/>
                 <w:szCs w:val="27"/>
               </w:rPr>
-              <w:t xml:space="preserve">18 </w:t>
-            </w:r>
-            <w:r>
-              <w:rPr>
-                <w:rFonts w:ascii="Times New Roman" w:hAnsi="Times New Roman" w:cs="Times New Roman"/>
-                <w:i/>
+            </w:pPr>
+          </w:p>
+          <w:p>
+            <w:pPr>
+              <w:jc w:val="center"/>
+              <w:rPr>
+                <w:rFonts w:ascii="Times New Roman" w:hAnsi="Times New Roman" w:cs="Times New Roman"/>
                 <w:sz w:val="27"/>
                 <w:szCs w:val="27"/>
               </w:rPr>
-              <w:t xml:space="preserve"> tháng</w:t>
-            </w:r>
-            <w:r>
-              <w:rPr>
-                <w:rFonts w:ascii="Times New Roman" w:hAnsi="Times New Roman" w:cs="Times New Roman"/>
-                <w:i/>
+            </w:pPr>
+          </w:p>
+          <w:p>
+            <w:pPr>
+              <w:jc w:val="center"/>
+              <w:rPr>
+                <w:rFonts w:ascii="Times New Roman" w:hAnsi="Times New Roman" w:cs="Times New Roman"/>
                 <w:sz w:val="27"/>
                 <w:szCs w:val="27"/>
               </w:rPr>
-              <w:t xml:space="preserve"> 05</w:t>
-            </w:r>
-            <w:r>
-              <w:rPr>
-                <w:rFonts w:ascii="Times New Roman" w:hAnsi="Times New Roman" w:cs="Times New Roman"/>
-                <w:i/>
-                <w:sz w:val="27"/>
-                <w:szCs w:val="27"/>
-              </w:rPr>
-              <w:t xml:space="preserve"> năm</w:t>
-            </w:r>
-            <w:r>
-              <w:rPr>
-                <w:rFonts w:ascii="Times New Roman" w:hAnsi="Times New Roman" w:cs="Times New Roman"/>
-                <w:i/>
-                <w:sz w:val="27"/>
-                <w:szCs w:val="27"/>
-              </w:rPr>
-              <w:t xml:space="preserve"> </w:t>
-            </w:r>
-            <w:r>
-              <w:rPr>
-                <w:rFonts w:ascii="Times New Roman" w:hAnsi="Times New Roman" w:cs="Times New Roman"/>
-                <w:i/>
-                <w:sz w:val="27"/>
-                <w:szCs w:val="27"/>
-              </w:rPr>
-              <w:t>2026</w:t>
-            </w:r>
-          </w:p>
-          <w:p>
-            <w:pPr>
-              <w:jc w:val="center"/>
-              <w:rPr>
-                <w:rFonts w:ascii="Times New Roman" w:hAnsi="Times New Roman" w:cs="Times New Roman"/>
-                <w:b/>
-                <w:sz w:val="27"/>
-                <w:szCs w:val="27"/>
-              </w:rPr>
-            </w:pPr>
-            <w:r>
-              <w:rPr>
-                <w:rFonts w:ascii="Times New Roman" w:hAnsi="Times New Roman" w:cs="Times New Roman"/>
-                <w:b/>
-                <w:sz w:val="27"/>
-                <w:szCs w:val="27"/>
-              </w:rPr>
-              <w:t>Tác giả sáng kiến</w:t>
-            </w:r>
-          </w:p>
-          <w:p>
-            <w:pPr>
-              <w:jc w:val="center"/>
-              <w:rPr>
-                <w:rFonts w:ascii="Times New Roman" w:hAnsi="Times New Roman" w:cs="Times New Roman"/>
-                <w:i/>
-                <w:sz w:val="27"/>
-                <w:szCs w:val="27"/>
-              </w:rPr>
-            </w:pPr>
-          </w:p>
-          <w:p>
-            <w:pPr>
-              <w:jc w:val="center"/>
-              <w:rPr>
-                <w:rFonts w:ascii="Times New Roman" w:hAnsi="Times New Roman" w:cs="Times New Roman"/>
-                <w:sz w:val="27"/>
-                <w:szCs w:val="27"/>
-              </w:rPr>
-            </w:pPr>
-          </w:p>
-          <w:p>
-            <w:pPr>
-              <w:jc w:val="center"/>
-              <w:rPr>
-                <w:rFonts w:ascii="Times New Roman" w:hAnsi="Times New Roman" w:cs="Times New Roman"/>
-                <w:sz w:val="27"/>
-                <w:szCs w:val="27"/>
-              </w:rPr>
             </w:pPr>
           </w:p>
         </w:tc>
       </w:tr>
+      <w:bookmarkEnd w:id="0"/>
     </w:tbl>
-    <w:bookmarkEnd w:id="0"/>
-    <w:p>
-      <w:pPr>
-        <w:shd w:val="clear" w:color="auto" w:fill="FFFFFF"/>
-        <w:spacing w:before="120"/>
-        <w:jc w:val="both"/>
-        <w:rPr>
-          <w:rFonts w:ascii="Times New Roman" w:hAnsi="Times New Roman" w:cs="Times New Roman"/>
-          <w:sz w:val="27"/>
-          <w:szCs w:val="27"/>
-          <w:lang w:val="vi-VN"/>
-        </w:rPr>
-      </w:pPr>
-      <w:r>
-        <w:rPr>
-          <w:rFonts w:ascii="Times New Roman" w:hAnsi="Times New Roman" w:cs="Times New Roman"/>
-          <w:sz w:val="27"/>
-          <w:szCs w:val="27"/>
-        </w:rPr>
-        <w:t>+ Không có. Phần mềm chạy độc lập (offline) trên máy tính cá nhân, không gửi dữ liệu lên mạng, nên thông tin nội bộ của nhà trường được giữ an toàn.</w:t>
-      </w:r>
-    </w:p>
     <w:p>
       <w:pPr>
         <w:rPr>
@@ -7092,20 +6962,8 @@
           <w:sz w:val="27"/>
           <w:szCs w:val="27"/>
         </w:rPr>
-        <w:t>Sáng kiến đề xuất xây dựng và đưa vào sử dụng một công cụ phần mềm tích hợp, viết bằng ngôn ngữ Python với giao diện đồ họa Tkinter thân thiện, nhằm tự động hóa và nâng cao năng lực xử lý dữ liệu khảo sát ý kiến sinh viên. Phần mềm thay thế hoàn toàn quy trình thủ công bằng việc cung cấp 3 phân hệ chức năng chính: tự động nhận diện và kiểm tra tính toàn vẹn của dữ liệu đầu vào (hỗ trợ cả định dạng .xls và .xlsx); xử lý thống kê định lượng và tự động xuất các báo cáo Word theo biểu mẫu quy định của nhà trường; trích xuất và phân loại ý kiến phản hồi tự luận của sinh viên bằng giải thuật phân tích ngôn ngữ tự nhiên offline (phân chia theo chủ đề đóng góp và sắc thái tình cảm) giúp bảo mật thông tin nội bộ.</w:t>
-      </w:r>
-    </w:p>
-    <w:p>
-      <w:pPr>
-        <w:spacing w:after="0"/>
-        <w:ind w:firstLine="720"/>
-        <w:jc w:val="both"/>
-        <w:rPr>
-          <w:rFonts w:ascii="Times New Roman" w:hAnsi="Times New Roman" w:cs="Times New Roman"/>
-          <w:sz w:val="27"/>
-          <w:szCs w:val="27"/>
-        </w:rPr>
-      </w:pPr>
+        <w:t>Sáng kiến đề xuất xây dựng và đưa vào sử dụng một công cụ phần mềm tích hợp, viết bằng ngôn ngữ Python với giao diện đồ họa Tkinter thân thiện, nhằm tự động hóa và nâng cao năng lực phân tích dữ liệu khảo sát ý kiến sinh viên. Phần mềm thay thế hoàn toàn quy trình thủ công bằng việc cung cấp 4 phân hệ chức năng: tự động nhận diện và kiểm tra tính toàn vẹn của dữ liệu đầu vào (hỗ trợ cả định dạng .xls và .xlsx); xử lý thống kê định lượng và tự động xuất các báo cáo Word theo biểu mẫu quy định kèm theo báo cáo phân tích biểu đồ trực quan; trích xuất và phân loại ý kiến phản hồi tự luận của sinh viên bằng giải thuật phân tích ngôn ngữ tự nhiên offline (phân chia theo chủ đề đóng góp và sắc thái tình cảm); và theo dõi lịch sử, vẽ biểu đồ xu hướng chất lượng giảng dạy qua các học kỳ để làm minh chứng cải tiến liên tục cho công tác kiểm định chất lượng giáo dục.</w:t>
+      </w:r>
     </w:p>
     <w:p>
       <w:pPr>
@@ -7309,7 +7167,6 @@
           <w:sz w:val="27"/>
           <w:szCs w:val="27"/>
         </w:rPr>
-        <w:lastRenderedPageBreak/>
         <w:t>Các điều kiện cần thiết để áp dụng sáng kiến:</w:t>
       </w:r>
       <w:r>
@@ -7358,7 +7215,7 @@
           <w:sz w:val="27"/>
           <w:szCs w:val="27"/>
         </w:rPr>
-        <w:t>Đánh giá lợi ích thu được hoặc dự kiến có thể thu được do áp dụng sáng kiến theo ý kiến của tác giả: Tiết kiệm nhiều giờ làm việc trong mỗi đợt khảo sát cuối học kỳ. Việc tự động hóa giúp hạn chế các lỗi thường gặp khi tính toán bằng Excel hay khi sao chép nhầm giữa các file. Nhờ vậy, chuyên viên đảm bảo chất lượng có thêm thời gian cho việc phân tích dữ liệu và đề xuất cải tiến.</w:t>
+        <w:t xml:space="preserve">Đánh giá lợi ích thu được hoặc dự kiến có thể thu được do áp dụng sáng kiến theo ý kiến của tác giả: Tiết kiệm nhiều giờ làm việc trong mỗi đợt khảo sát cuối học kỳ. Việc tự động hóa giúp hạn chế các lỗi thường gặp khi tính toán bằng Excel hay khi sao </w:t>
       </w:r>
       <w:r>
         <w:rPr>
@@ -7367,6 +7224,8 @@
           <w:sz w:val="27"/>
           <w:szCs w:val="27"/>
         </w:rPr>
+        <w:lastRenderedPageBreak/>
+        <w:t>chép nhầm giữa các file. Nhờ vậy, chuyên viên đảm bảo chất lượng có thêm thời gian cho việc phân tích dữ liệu và đề xuất cải tiến.</w:t>
       </w:r>
     </w:p>
     <w:p>
@@ -7398,13 +7257,6 @@
           <w:szCs w:val="27"/>
         </w:rPr>
         <w:t>Đánh giá lợi ích thu được hoặc dự kiến có thể thu được do áp dụng sáng kiến theo ý kiến của tổ chức, cá nhân đã tham gia áp dụng sáng kiến lần đầu, kể cả áp dụng thử (nếu có): Công cụ chạy ổn định trên nhiều cấu hình máy khác nhau, giao diện trực quan và dễ thao tác. Tốc độ xử lý theo lô nhanh, kết quả trích xuất đúng với dữ liệu gốc và đúng định dạng nhà trường yêu cầu.</w:t>
-      </w:r>
-      <w:r>
-        <w:rPr>
-          <w:rFonts w:ascii="Times New Roman" w:hAnsi="Times New Roman" w:cs="Times New Roman"/>
-          <w:sz w:val="27"/>
-          <w:szCs w:val="27"/>
-        </w:rPr>
       </w:r>
     </w:p>
     <w:p>
@@ -8808,7 +8660,6 @@
                 <w:sz w:val="26"/>
                 <w:szCs w:val="26"/>
               </w:rPr>
-              <w:lastRenderedPageBreak/>
               <w:t>7</w:t>
             </w:r>
           </w:p>
@@ -9174,6 +9025,7 @@
           <w:szCs w:val="27"/>
           <w:lang w:val="vi-VN"/>
         </w:rPr>
+        <w:lastRenderedPageBreak/>
         <w:t>Tôi xin cam đoan mọi thông tin nêu trong đơn là trung thực, đúng sự thật và hoàn toàn chịu trách nhiệm trước pháp luật./.</w:t>
       </w:r>
     </w:p>

</xml_diff>